<commit_message>
Altai Jingle Bells Mmongolian 11.Week Finish
</commit_message>
<xml_diff>
--- a/Raporlar/11. Hafta.docx
+++ b/Raporlar/11. Hafta.docx
@@ -551,10 +551,7 @@
         <w:spacing w:after="0" w:line="240" w:lineRule="auto"/>
       </w:pPr>
       <w:r>
-        <w:t>Bu sorgu, adı "n" harfiyle biten yazarların tam adını ve yazdıkları toplam kitap sa</w:t>
-      </w:r>
-      <w:r>
-        <w:t xml:space="preserve">yısını alfabetik olarak sıralar. </w:t>
+        <w:t xml:space="preserve">Bu sorgu, adı "n" harfiyle biten yazarların tam adını ve yazdıkları toplam kitap sayısını alfabetik olarak sıralar. </w:t>
       </w:r>
     </w:p>
     <w:p>
@@ -653,27 +650,15 @@
         <w:t xml:space="preserve">-- </w:t>
       </w:r>
       <w:r>
-        <w:t>Yazar ve Kitap tablolarını YazarID sütunları üzerinden birleştir</w:t>
-      </w:r>
-      <w:r>
-        <w:t xml:space="preserve">. </w:t>
-      </w:r>
-      <w:r>
-        <w:t xml:space="preserve">Bu eşleşmeyle, </w:t>
-      </w:r>
-      <w:r>
-        <w:t>her kitabın hangi</w:t>
-      </w:r>
-    </w:p>
-    <w:p>
-      <w:pPr>
-        <w:spacing w:after="0" w:line="240" w:lineRule="auto"/>
-      </w:pPr>
-      <w:r>
-        <w:t xml:space="preserve">               </w:t>
-      </w:r>
-      <w:r>
-        <w:t>yazara ait olduğu belirlenir.</w:t>
+        <w:t>Yazar ve Kitap tablolarını YazarID sütunları üzerinden birleştir. Bu eşleşmeyle, her kitabın hangi</w:t>
+      </w:r>
+    </w:p>
+    <w:p>
+      <w:pPr>
+        <w:spacing w:after="0" w:line="240" w:lineRule="auto"/>
+      </w:pPr>
+      <w:r>
+        <w:t xml:space="preserve">               yazara ait olduğu belirlenir.</w:t>
       </w:r>
     </w:p>
     <w:p>
@@ -694,16 +679,7 @@
       </w:pPr>
       <w:r>
         <w:tab/>
-        <w:t xml:space="preserve">-- </w:t>
-      </w:r>
-      <w:r>
-        <w:t>Aynı adı ve soyadı olan yazarları gruplandır.</w:t>
-      </w:r>
-      <w:r>
-        <w:t xml:space="preserve"> </w:t>
-      </w:r>
-      <w:r>
-        <w:t>Gruplama, her yazar için bir satır oluşturur.</w:t>
+        <w:t>-- Aynı adı ve soyadı olan yazarları gruplandır. Gruplama, her yazar için bir satır oluşturur.</w:t>
       </w:r>
     </w:p>
     <w:p>
@@ -779,9 +755,1263 @@
         </w:drawing>
       </w:r>
     </w:p>
+    <w:p>
+      <w:pPr>
+        <w:spacing w:after="0" w:line="240" w:lineRule="auto"/>
+      </w:pPr>
+    </w:p>
+    <w:p>
+      <w:pPr>
+        <w:spacing w:after="0" w:line="240" w:lineRule="auto"/>
+      </w:pPr>
+    </w:p>
+    <w:p>
+      <w:pPr>
+        <w:spacing w:after="0" w:line="240" w:lineRule="auto"/>
+      </w:pPr>
+    </w:p>
+    <w:p>
+      <w:pPr>
+        <w:spacing w:after="0" w:line="240" w:lineRule="auto"/>
+      </w:pPr>
+    </w:p>
+    <w:p>
+      <w:pPr>
+        <w:pStyle w:val="ListeParagraf"/>
+        <w:numPr>
+          <w:ilvl w:val="0"/>
+          <w:numId w:val="17"/>
+        </w:numPr>
+        <w:spacing w:after="0" w:line="240" w:lineRule="auto"/>
+      </w:pPr>
+      <w:r>
+        <w:lastRenderedPageBreak/>
+        <w:t>Her kategori için toplam kitap sayısını ve mevcut kitap adetini listeleme</w:t>
+      </w:r>
+    </w:p>
+    <w:p>
+      <w:pPr>
+        <w:pStyle w:val="ListeParagraf"/>
+        <w:numPr>
+          <w:ilvl w:val="1"/>
+          <w:numId w:val="17"/>
+        </w:numPr>
+        <w:spacing w:after="0" w:line="240" w:lineRule="auto"/>
+      </w:pPr>
+      <w:r>
+        <w:t>SELECT K.Turu AS Kategori, COUNT(Kitap.KitapID) AS KitapÇeşitSayısı, SUM(Kitap.Adet) AS ToplamAdet</w:t>
+      </w:r>
+    </w:p>
+    <w:p>
+      <w:pPr>
+        <w:spacing w:after="0" w:line="240" w:lineRule="auto"/>
+        <w:ind w:left="1080" w:firstLine="360"/>
+      </w:pPr>
+      <w:r>
+        <w:t>FROM Kategori K</w:t>
+      </w:r>
+    </w:p>
+    <w:p>
+      <w:pPr>
+        <w:spacing w:after="0" w:line="240" w:lineRule="auto"/>
+        <w:ind w:left="1080" w:firstLine="360"/>
+      </w:pPr>
+      <w:r>
+        <w:t>LEFT JOIN Kitap ON K.KategoriID = Kitap.KategoriID</w:t>
+      </w:r>
+    </w:p>
+    <w:p>
+      <w:pPr>
+        <w:spacing w:after="0" w:line="240" w:lineRule="auto"/>
+        <w:ind w:left="1080" w:firstLine="360"/>
+      </w:pPr>
+      <w:r>
+        <w:t>GROUP BY K.Turu</w:t>
+      </w:r>
+    </w:p>
+    <w:p>
+      <w:pPr>
+        <w:spacing w:after="0" w:line="240" w:lineRule="auto"/>
+        <w:ind w:left="1080" w:firstLine="360"/>
+      </w:pPr>
+      <w:r>
+        <w:t>ORDER BY KitapÇeşitSayısı DESC;</w:t>
+      </w:r>
+    </w:p>
+    <w:p>
+      <w:pPr>
+        <w:spacing w:after="0" w:line="240" w:lineRule="auto"/>
+      </w:pPr>
+    </w:p>
+    <w:p>
+      <w:pPr>
+        <w:spacing w:after="0" w:line="240" w:lineRule="auto"/>
+      </w:pPr>
+      <w:r>
+        <w:tab/>
+        <w:t xml:space="preserve">-- </w:t>
+      </w:r>
+      <w:r>
+        <w:t>Kategor</w:t>
+      </w:r>
+      <w:r>
+        <w:t xml:space="preserve">i tablosundan kategorinin adını </w:t>
+      </w:r>
+      <w:r>
+        <w:t>alır ve sonuçta "Kategori" sütunu olarak adlandırır.</w:t>
+      </w:r>
+    </w:p>
+    <w:p>
+      <w:pPr>
+        <w:spacing w:after="0" w:line="240" w:lineRule="auto"/>
+      </w:pPr>
+      <w:r>
+        <w:tab/>
+        <w:t>-- Her kategoride bulunan kitap türlerinin sayısını hesaplar.</w:t>
+      </w:r>
+    </w:p>
+    <w:p>
+      <w:pPr>
+        <w:spacing w:after="0" w:line="240" w:lineRule="auto"/>
+      </w:pPr>
+      <w:r>
+        <w:tab/>
+        <w:t>-- Her kategorideki kitapların toplam mevcut adetlerini hesaplar.</w:t>
+      </w:r>
+    </w:p>
+    <w:p>
+      <w:pPr>
+        <w:spacing w:after="0" w:line="240" w:lineRule="auto"/>
+      </w:pPr>
+      <w:r>
+        <w:tab/>
+        <w:t>-- Kategori ve Kitap tablolarını KategoriID sütunları üzerinden birleştirir.</w:t>
+      </w:r>
+    </w:p>
+    <w:p>
+      <w:pPr>
+        <w:spacing w:after="0" w:line="240" w:lineRule="auto"/>
+        <w:ind w:firstLine="720"/>
+      </w:pPr>
+      <w:r>
+        <w:t xml:space="preserve">LEFT JOIN sayesinde, Kategori tablosundaki her kayıt dahil edilir, ancak bir kategoride kitap </w:t>
+      </w:r>
+    </w:p>
+    <w:p>
+      <w:pPr>
+        <w:spacing w:after="0" w:line="240" w:lineRule="auto"/>
+        <w:ind w:firstLine="720"/>
+      </w:pPr>
+      <w:r>
+        <w:t>yoksa ilgili sütunlar NULL döner.</w:t>
+      </w:r>
+    </w:p>
+    <w:p>
+      <w:pPr>
+        <w:spacing w:after="0" w:line="240" w:lineRule="auto"/>
+        <w:ind w:left="720"/>
+      </w:pPr>
+      <w:r>
+        <w:t>-- Kategorilere (Turu sütununa) göre veriyi gruplar.Bu gruplar üzerinde COUNT ve SUM işlemleri uygulanır.</w:t>
+      </w:r>
+    </w:p>
+    <w:p>
+      <w:pPr>
+        <w:spacing w:after="0" w:line="240" w:lineRule="auto"/>
+        <w:ind w:firstLine="720"/>
+      </w:pPr>
+      <w:r>
+        <w:t xml:space="preserve">-- </w:t>
+      </w:r>
+      <w:r>
+        <w:t>Sonuçları, her kategorideki kitap türlerinin sayısına (KitapÇeşitSayısı) göre azalan sırayla sıralar.</w:t>
+      </w:r>
+    </w:p>
+    <w:p>
+      <w:pPr>
+        <w:spacing w:after="0" w:line="240" w:lineRule="auto"/>
+      </w:pPr>
+    </w:p>
+    <w:p>
+      <w:pPr>
+        <w:spacing w:after="0" w:line="240" w:lineRule="auto"/>
+      </w:pPr>
+      <w:r>
+        <w:tab/>
+      </w:r>
+      <w:r>
+        <w:rPr>
+          <w:noProof/>
+          <w:lang w:eastAsia="tr-TR"/>
+        </w:rPr>
+        <w:drawing>
+          <wp:inline distT="0" distB="0" distL="0" distR="0">
+            <wp:extent cx="3989070" cy="2773045"/>
+            <wp:effectExtent l="19050" t="0" r="0" b="0"/>
+            <wp:docPr id="3" name="Resim 1"/>
+            <wp:cNvGraphicFramePr>
+              <a:graphicFrameLocks xmlns:a="http://schemas.openxmlformats.org/drawingml/2006/main" noChangeAspect="1"/>
+            </wp:cNvGraphicFramePr>
+            <a:graphic xmlns:a="http://schemas.openxmlformats.org/drawingml/2006/main">
+              <a:graphicData uri="http://schemas.openxmlformats.org/drawingml/2006/picture">
+                <pic:pic xmlns:pic="http://schemas.openxmlformats.org/drawingml/2006/picture">
+                  <pic:nvPicPr>
+                    <pic:cNvPr id="0" name="Picture 1"/>
+                    <pic:cNvPicPr>
+                      <a:picLocks noChangeAspect="1" noChangeArrowheads="1"/>
+                    </pic:cNvPicPr>
+                  </pic:nvPicPr>
+                  <pic:blipFill>
+                    <a:blip r:embed="rId9"/>
+                    <a:srcRect/>
+                    <a:stretch>
+                      <a:fillRect/>
+                    </a:stretch>
+                  </pic:blipFill>
+                  <pic:spPr bwMode="auto">
+                    <a:xfrm>
+                      <a:off x="0" y="0"/>
+                      <a:ext cx="3989070" cy="2773045"/>
+                    </a:xfrm>
+                    <a:prstGeom prst="rect">
+                      <a:avLst/>
+                    </a:prstGeom>
+                    <a:noFill/>
+                    <a:ln w="9525">
+                      <a:noFill/>
+                      <a:miter lim="800000"/>
+                      <a:headEnd/>
+                      <a:tailEnd/>
+                    </a:ln>
+                  </pic:spPr>
+                </pic:pic>
+              </a:graphicData>
+            </a:graphic>
+          </wp:inline>
+        </w:drawing>
+      </w:r>
+    </w:p>
+    <w:p>
+      <w:pPr>
+        <w:spacing w:after="0" w:line="240" w:lineRule="auto"/>
+      </w:pPr>
+    </w:p>
+    <w:p>
+      <w:pPr>
+        <w:pStyle w:val="ListeParagraf"/>
+        <w:numPr>
+          <w:ilvl w:val="0"/>
+          <w:numId w:val="17"/>
+        </w:numPr>
+        <w:spacing w:after="0" w:line="240" w:lineRule="auto"/>
+      </w:pPr>
+      <w:r>
+        <w:t>Ödünç alınan kitapları, ödünç alan üyeleriyle birlikte listeler.</w:t>
+      </w:r>
+    </w:p>
+    <w:p>
+      <w:pPr>
+        <w:pStyle w:val="ListeParagraf"/>
+        <w:numPr>
+          <w:ilvl w:val="1"/>
+          <w:numId w:val="17"/>
+        </w:numPr>
+        <w:spacing w:after="0" w:line="240" w:lineRule="auto"/>
+      </w:pPr>
+      <w:r>
+        <w:t xml:space="preserve">SELECT K.KitapAdi, U.UyeAdi || ' ' || U.UyeSoyad AS Uye, O.OduncAlmaTarih </w:t>
+      </w:r>
+    </w:p>
+    <w:p>
+      <w:pPr>
+        <w:spacing w:after="0" w:line="240" w:lineRule="auto"/>
+        <w:ind w:left="1080" w:firstLine="360"/>
+      </w:pPr>
+      <w:r>
+        <w:t>FROM Odunc O</w:t>
+      </w:r>
+    </w:p>
+    <w:p>
+      <w:pPr>
+        <w:spacing w:after="0" w:line="240" w:lineRule="auto"/>
+        <w:ind w:left="1080" w:firstLine="360"/>
+      </w:pPr>
+      <w:r>
+        <w:t>INNER JOIN Kitap K ON O.KitapID = K.KitapID</w:t>
+      </w:r>
+    </w:p>
+    <w:p>
+      <w:pPr>
+        <w:spacing w:after="0" w:line="240" w:lineRule="auto"/>
+        <w:ind w:left="1080" w:firstLine="360"/>
+      </w:pPr>
+      <w:r>
+        <w:t>INNER JOIN Uye U ON O.UyeID = U.UyeID</w:t>
+      </w:r>
+    </w:p>
+    <w:p>
+      <w:pPr>
+        <w:spacing w:after="0" w:line="240" w:lineRule="auto"/>
+        <w:ind w:left="1080" w:firstLine="360"/>
+      </w:pPr>
+      <w:r>
+        <w:t>ORDER BY O.OduncAlmaTarih DESC;</w:t>
+      </w:r>
+    </w:p>
+    <w:p>
+      <w:pPr>
+        <w:spacing w:after="0" w:line="240" w:lineRule="auto"/>
+      </w:pPr>
+    </w:p>
+    <w:p>
+      <w:pPr>
+        <w:spacing w:after="0" w:line="240" w:lineRule="auto"/>
+      </w:pPr>
+      <w:r>
+        <w:tab/>
+        <w:t>-- Üye adı ve soyadını tek bir sütunda birleştirir ve 3 sütun seçtik</w:t>
+      </w:r>
+    </w:p>
+    <w:p>
+      <w:pPr>
+        <w:spacing w:after="0" w:line="240" w:lineRule="auto"/>
+      </w:pPr>
+      <w:r>
+        <w:tab/>
+        <w:t xml:space="preserve">-- </w:t>
+      </w:r>
+      <w:r>
+        <w:t xml:space="preserve">Odunc tablosundaki KitapID ile Kitap tablosundaki KitapID eşleşmesini yap. Böylece her ödünç </w:t>
+      </w:r>
+    </w:p>
+    <w:p>
+      <w:pPr>
+        <w:spacing w:after="0" w:line="240" w:lineRule="auto"/>
+        <w:ind w:firstLine="720"/>
+      </w:pPr>
+      <w:r>
+        <w:t>işlemiyle ilgili kitap bilgileri eklenir.</w:t>
+      </w:r>
+    </w:p>
+    <w:p>
+      <w:pPr>
+        <w:spacing w:after="0" w:line="240" w:lineRule="auto"/>
+        <w:ind w:left="720"/>
+      </w:pPr>
+      <w:r>
+        <w:t xml:space="preserve">-- </w:t>
+      </w:r>
+      <w:r>
+        <w:t>Odunc tablosundaki UyeID ile Uye tablosundaki UyeID eşleştirilir.</w:t>
+      </w:r>
+      <w:r>
+        <w:t xml:space="preserve"> </w:t>
+      </w:r>
+      <w:r>
+        <w:t>Bu işlem, ödünç alma işlemini gerçekleştiren üyenin bilgilerini ekler.</w:t>
+      </w:r>
+    </w:p>
+    <w:p>
+      <w:pPr>
+        <w:spacing w:after="0" w:line="240" w:lineRule="auto"/>
+        <w:ind w:firstLine="720"/>
+      </w:pPr>
+      <w:r>
+        <w:lastRenderedPageBreak/>
+        <w:t>-- Ödünç alma tarihine göre sıralama yapılır.</w:t>
+      </w:r>
+    </w:p>
+    <w:p>
+      <w:pPr>
+        <w:spacing w:after="0" w:line="240" w:lineRule="auto"/>
+        <w:ind w:firstLine="720"/>
+      </w:pPr>
+    </w:p>
+    <w:p>
+      <w:pPr>
+        <w:spacing w:after="0" w:line="240" w:lineRule="auto"/>
+        <w:ind w:firstLine="720"/>
+      </w:pPr>
+      <w:r>
+        <w:rPr>
+          <w:noProof/>
+          <w:lang w:eastAsia="tr-TR"/>
+        </w:rPr>
+        <w:drawing>
+          <wp:inline distT="0" distB="0" distL="0" distR="0">
+            <wp:extent cx="4270375" cy="2820670"/>
+            <wp:effectExtent l="19050" t="0" r="0" b="0"/>
+            <wp:docPr id="4" name="Resim 4"/>
+            <wp:cNvGraphicFramePr>
+              <a:graphicFrameLocks xmlns:a="http://schemas.openxmlformats.org/drawingml/2006/main" noChangeAspect="1"/>
+            </wp:cNvGraphicFramePr>
+            <a:graphic xmlns:a="http://schemas.openxmlformats.org/drawingml/2006/main">
+              <a:graphicData uri="http://schemas.openxmlformats.org/drawingml/2006/picture">
+                <pic:pic xmlns:pic="http://schemas.openxmlformats.org/drawingml/2006/picture">
+                  <pic:nvPicPr>
+                    <pic:cNvPr id="0" name="Picture 4"/>
+                    <pic:cNvPicPr>
+                      <a:picLocks noChangeAspect="1" noChangeArrowheads="1"/>
+                    </pic:cNvPicPr>
+                  </pic:nvPicPr>
+                  <pic:blipFill>
+                    <a:blip r:embed="rId10"/>
+                    <a:srcRect/>
+                    <a:stretch>
+                      <a:fillRect/>
+                    </a:stretch>
+                  </pic:blipFill>
+                  <pic:spPr bwMode="auto">
+                    <a:xfrm>
+                      <a:off x="0" y="0"/>
+                      <a:ext cx="4270375" cy="2820670"/>
+                    </a:xfrm>
+                    <a:prstGeom prst="rect">
+                      <a:avLst/>
+                    </a:prstGeom>
+                    <a:noFill/>
+                    <a:ln w="9525">
+                      <a:noFill/>
+                      <a:miter lim="800000"/>
+                      <a:headEnd/>
+                      <a:tailEnd/>
+                    </a:ln>
+                  </pic:spPr>
+                </pic:pic>
+              </a:graphicData>
+            </a:graphic>
+          </wp:inline>
+        </w:drawing>
+      </w:r>
+    </w:p>
+    <w:p>
+      <w:pPr>
+        <w:spacing w:after="0" w:line="240" w:lineRule="auto"/>
+      </w:pPr>
+    </w:p>
+    <w:p>
+      <w:pPr>
+        <w:pStyle w:val="ListeParagraf"/>
+        <w:numPr>
+          <w:ilvl w:val="0"/>
+          <w:numId w:val="17"/>
+        </w:numPr>
+        <w:spacing w:after="0" w:line="240" w:lineRule="auto"/>
+      </w:pPr>
+      <w:r>
+        <w:t>T</w:t>
+      </w:r>
+      <w:r>
+        <w:t>eslim edilmemiş (geri getirilmemiş) kitapların sayısını, Kitap tablosundaki mevcut adetlerden (Adet) düşürmek.</w:t>
+      </w:r>
+    </w:p>
+    <w:p>
+      <w:pPr>
+        <w:pStyle w:val="ListeParagraf"/>
+        <w:numPr>
+          <w:ilvl w:val="0"/>
+          <w:numId w:val="21"/>
+        </w:numPr>
+        <w:spacing w:after="0" w:line="240" w:lineRule="auto"/>
+      </w:pPr>
+      <w:r>
+        <w:t>UPDATE Kitap</w:t>
+      </w:r>
+    </w:p>
+    <w:p>
+      <w:pPr>
+        <w:spacing w:after="0" w:line="240" w:lineRule="auto"/>
+        <w:ind w:left="1080" w:firstLine="360"/>
+      </w:pPr>
+      <w:r>
+        <w:t>SET Adet = Adet - (</w:t>
+      </w:r>
+    </w:p>
+    <w:p>
+      <w:pPr>
+        <w:spacing w:after="0" w:line="240" w:lineRule="auto"/>
+        <w:ind w:left="1080" w:firstLine="360"/>
+      </w:pPr>
+      <w:r>
+        <w:t xml:space="preserve">    SELECT COUNT(*) </w:t>
+      </w:r>
+    </w:p>
+    <w:p>
+      <w:pPr>
+        <w:spacing w:after="0" w:line="240" w:lineRule="auto"/>
+        <w:ind w:left="1080" w:firstLine="360"/>
+      </w:pPr>
+      <w:r>
+        <w:t xml:space="preserve">    FROM Odunc </w:t>
+      </w:r>
+    </w:p>
+    <w:p>
+      <w:pPr>
+        <w:spacing w:after="0" w:line="240" w:lineRule="auto"/>
+        <w:ind w:left="1080" w:firstLine="360"/>
+      </w:pPr>
+      <w:r>
+        <w:t xml:space="preserve">    WHERE Kitap.KitapID = Odunc.KitapID AND GercekTeslimTarih IS NULL</w:t>
+      </w:r>
+    </w:p>
+    <w:p>
+      <w:pPr>
+        <w:spacing w:after="0" w:line="240" w:lineRule="auto"/>
+        <w:ind w:left="1080" w:firstLine="360"/>
+      </w:pPr>
+      <w:r>
+        <w:t>)</w:t>
+      </w:r>
+    </w:p>
+    <w:p>
+      <w:pPr>
+        <w:spacing w:after="0" w:line="240" w:lineRule="auto"/>
+        <w:ind w:left="1080" w:firstLine="360"/>
+      </w:pPr>
+      <w:r>
+        <w:t>WHERE EXISTS (</w:t>
+      </w:r>
+    </w:p>
+    <w:p>
+      <w:pPr>
+        <w:spacing w:after="0" w:line="240" w:lineRule="auto"/>
+        <w:ind w:left="1080" w:firstLine="360"/>
+      </w:pPr>
+      <w:r>
+        <w:t xml:space="preserve">    SELECT 1 </w:t>
+      </w:r>
+    </w:p>
+    <w:p>
+      <w:pPr>
+        <w:spacing w:after="0" w:line="240" w:lineRule="auto"/>
+        <w:ind w:left="1080" w:firstLine="360"/>
+      </w:pPr>
+      <w:r>
+        <w:t xml:space="preserve">    FROM Odunc </w:t>
+      </w:r>
+    </w:p>
+    <w:p>
+      <w:pPr>
+        <w:spacing w:after="0" w:line="240" w:lineRule="auto"/>
+        <w:ind w:left="1080" w:firstLine="360"/>
+      </w:pPr>
+      <w:r>
+        <w:t xml:space="preserve">    WHERE Kitap.KitapID = Odunc.KitapID AND GercekTeslimTarih IS NULL</w:t>
+      </w:r>
+    </w:p>
+    <w:p>
+      <w:pPr>
+        <w:spacing w:after="0" w:line="240" w:lineRule="auto"/>
+        <w:ind w:left="1080" w:firstLine="360"/>
+      </w:pPr>
+      <w:r>
+        <w:t>);</w:t>
+      </w:r>
+    </w:p>
+    <w:p>
+      <w:pPr>
+        <w:spacing w:after="0" w:line="240" w:lineRule="auto"/>
+      </w:pPr>
+    </w:p>
+    <w:p>
+      <w:pPr>
+        <w:spacing w:after="0" w:line="240" w:lineRule="auto"/>
+      </w:pPr>
+      <w:r>
+        <w:tab/>
+        <w:t xml:space="preserve">-- </w:t>
+      </w:r>
+      <w:r>
+        <w:t>Kitap tablosundaki Adet sütununu günceller.</w:t>
+      </w:r>
+    </w:p>
+    <w:p>
+      <w:pPr>
+        <w:spacing w:after="0" w:line="240" w:lineRule="auto"/>
+      </w:pPr>
+      <w:r>
+        <w:tab/>
+        <w:t xml:space="preserve">-- </w:t>
+      </w:r>
+      <w:r>
+        <w:t xml:space="preserve">Adet değerini, o kitabın teslim edilmiş ödünç sayısı kadar </w:t>
+      </w:r>
+      <w:r>
+        <w:t>azaltır</w:t>
+      </w:r>
+      <w:r>
+        <w:t>.</w:t>
+      </w:r>
+    </w:p>
+    <w:p>
+      <w:pPr>
+        <w:spacing w:after="0" w:line="240" w:lineRule="auto"/>
+      </w:pPr>
+      <w:r>
+        <w:tab/>
+        <w:t xml:space="preserve">-- </w:t>
+      </w:r>
+      <w:r>
+        <w:t xml:space="preserve">Odunc tablosunda KitapID eşleşen kitaplar için teslim edilmiş ödünç kayıtlarını </w:t>
+      </w:r>
+    </w:p>
+    <w:p>
+      <w:pPr>
+        <w:spacing w:after="0" w:line="240" w:lineRule="auto"/>
+      </w:pPr>
+      <w:r>
+        <w:tab/>
+      </w:r>
+      <w:r>
+        <w:t>(GercekTeslimTarih IS NULL) sayar</w:t>
+      </w:r>
+    </w:p>
+    <w:p>
+      <w:pPr>
+        <w:spacing w:after="0" w:line="240" w:lineRule="auto"/>
+      </w:pPr>
+      <w:r>
+        <w:tab/>
+        <w:t xml:space="preserve">-- </w:t>
+      </w:r>
+      <w:r>
+        <w:t xml:space="preserve">Kitap tablosundaki her kitap için, teslim edilmemiş ödünç kayıtlarının olup olmadığını kontrol </w:t>
+      </w:r>
+    </w:p>
+    <w:p>
+      <w:pPr>
+        <w:spacing w:after="0" w:line="240" w:lineRule="auto"/>
+        <w:ind w:firstLine="720"/>
+      </w:pPr>
+      <w:r>
+        <w:t>eder.Eğer teslim edilmemiş bir kayıt varsa, sadece o kitabın Adet sütunu güncellenir.</w:t>
+      </w:r>
+    </w:p>
+    <w:p>
+      <w:pPr>
+        <w:spacing w:after="0" w:line="240" w:lineRule="auto"/>
+      </w:pPr>
+    </w:p>
+    <w:p>
+      <w:pPr>
+        <w:spacing w:after="0" w:line="240" w:lineRule="auto"/>
+      </w:pPr>
+    </w:p>
+    <w:p>
+      <w:pPr>
+        <w:spacing w:after="0" w:line="240" w:lineRule="auto"/>
+      </w:pPr>
+    </w:p>
+    <w:p>
+      <w:pPr>
+        <w:spacing w:after="0" w:line="240" w:lineRule="auto"/>
+      </w:pPr>
+    </w:p>
+    <w:p>
+      <w:pPr>
+        <w:spacing w:after="0" w:line="240" w:lineRule="auto"/>
+      </w:pPr>
+    </w:p>
+    <w:p>
+      <w:pPr>
+        <w:spacing w:after="0" w:line="240" w:lineRule="auto"/>
+      </w:pPr>
+    </w:p>
+    <w:p>
+      <w:pPr>
+        <w:spacing w:after="0" w:line="240" w:lineRule="auto"/>
+      </w:pPr>
+    </w:p>
+    <w:p>
+      <w:pPr>
+        <w:spacing w:after="0" w:line="240" w:lineRule="auto"/>
+      </w:pPr>
+    </w:p>
+    <w:p>
+      <w:pPr>
+        <w:pStyle w:val="ListeParagraf"/>
+        <w:numPr>
+          <w:ilvl w:val="0"/>
+          <w:numId w:val="17"/>
+        </w:numPr>
+        <w:spacing w:after="0" w:line="240" w:lineRule="auto"/>
+      </w:pPr>
+      <w:r>
+        <w:lastRenderedPageBreak/>
+        <w:t>Bu sorgu, teslim alınan kitapların sayısını, Kitap tablosundaki mevcut adede ekler.</w:t>
+      </w:r>
+    </w:p>
+    <w:p>
+      <w:pPr>
+        <w:pStyle w:val="ListeParagraf"/>
+        <w:numPr>
+          <w:ilvl w:val="1"/>
+          <w:numId w:val="17"/>
+        </w:numPr>
+        <w:spacing w:after="0" w:line="240" w:lineRule="auto"/>
+      </w:pPr>
+      <w:r>
+        <w:t>UPDATE Kitap</w:t>
+      </w:r>
+    </w:p>
+    <w:p>
+      <w:pPr>
+        <w:spacing w:after="0" w:line="240" w:lineRule="auto"/>
+        <w:ind w:left="1080" w:firstLine="360"/>
+      </w:pPr>
+      <w:r>
+        <w:t>SET Adet = Adet + (</w:t>
+      </w:r>
+    </w:p>
+    <w:p>
+      <w:pPr>
+        <w:spacing w:after="0" w:line="240" w:lineRule="auto"/>
+        <w:ind w:left="1080" w:firstLine="360"/>
+      </w:pPr>
+      <w:r>
+        <w:t xml:space="preserve">    SELECT COUNT(*) </w:t>
+      </w:r>
+    </w:p>
+    <w:p>
+      <w:pPr>
+        <w:spacing w:after="0" w:line="240" w:lineRule="auto"/>
+        <w:ind w:left="1080" w:firstLine="360"/>
+      </w:pPr>
+      <w:r>
+        <w:t xml:space="preserve">    FROM Odunc </w:t>
+      </w:r>
+    </w:p>
+    <w:p>
+      <w:pPr>
+        <w:spacing w:after="0" w:line="240" w:lineRule="auto"/>
+        <w:ind w:left="1080" w:firstLine="360"/>
+      </w:pPr>
+      <w:r>
+        <w:t xml:space="preserve">    WHERE Kitap.KitapID = Odunc.KitapID AND GercekTeslimTarih IS NOT NULL</w:t>
+      </w:r>
+    </w:p>
+    <w:p>
+      <w:pPr>
+        <w:spacing w:after="0" w:line="240" w:lineRule="auto"/>
+        <w:ind w:left="1080" w:firstLine="360"/>
+      </w:pPr>
+      <w:r>
+        <w:t>)</w:t>
+      </w:r>
+    </w:p>
+    <w:p>
+      <w:pPr>
+        <w:spacing w:after="0" w:line="240" w:lineRule="auto"/>
+        <w:ind w:left="1080" w:firstLine="360"/>
+      </w:pPr>
+      <w:r>
+        <w:t>WHERE EXISTS (</w:t>
+      </w:r>
+    </w:p>
+    <w:p>
+      <w:pPr>
+        <w:spacing w:after="0" w:line="240" w:lineRule="auto"/>
+        <w:ind w:left="1080" w:firstLine="360"/>
+      </w:pPr>
+      <w:r>
+        <w:t xml:space="preserve">    SELECT 1 </w:t>
+      </w:r>
+    </w:p>
+    <w:p>
+      <w:pPr>
+        <w:spacing w:after="0" w:line="240" w:lineRule="auto"/>
+        <w:ind w:left="1080" w:firstLine="360"/>
+      </w:pPr>
+      <w:r>
+        <w:t xml:space="preserve">    FROM Odunc </w:t>
+      </w:r>
+    </w:p>
+    <w:p>
+      <w:pPr>
+        <w:spacing w:after="0" w:line="240" w:lineRule="auto"/>
+        <w:ind w:left="1080" w:firstLine="360"/>
+      </w:pPr>
+      <w:r>
+        <w:t xml:space="preserve">    WHERE Kitap.KitapID = Odunc.KitapID AND GercekTeslimTarih IS NOT NULL</w:t>
+      </w:r>
+    </w:p>
+    <w:p>
+      <w:pPr>
+        <w:spacing w:after="0" w:line="240" w:lineRule="auto"/>
+        <w:ind w:left="1080" w:firstLine="360"/>
+      </w:pPr>
+      <w:r>
+        <w:t>);</w:t>
+      </w:r>
+    </w:p>
+    <w:p>
+      <w:pPr>
+        <w:spacing w:after="0" w:line="240" w:lineRule="auto"/>
+      </w:pPr>
+      <w:r>
+        <w:tab/>
+      </w:r>
+    </w:p>
+    <w:p>
+      <w:pPr>
+        <w:spacing w:after="0" w:line="240" w:lineRule="auto"/>
+      </w:pPr>
+      <w:r>
+        <w:tab/>
+        <w:t xml:space="preserve">-- </w:t>
+      </w:r>
+      <w:r>
+        <w:t>Kitap tablosundaki Adet sütununu günceller.</w:t>
+      </w:r>
+    </w:p>
+    <w:p>
+      <w:pPr>
+        <w:spacing w:after="0" w:line="240" w:lineRule="auto"/>
+      </w:pPr>
+      <w:r>
+        <w:tab/>
+        <w:t xml:space="preserve">-- </w:t>
+      </w:r>
+      <w:r>
+        <w:t>Adet değerini, o kitabın teslim edilmiş ödünç sayısı kadar artırır.</w:t>
+      </w:r>
+    </w:p>
+    <w:p>
+      <w:pPr>
+        <w:spacing w:after="0" w:line="240" w:lineRule="auto"/>
+      </w:pPr>
+      <w:r>
+        <w:tab/>
+        <w:t xml:space="preserve">-- </w:t>
+      </w:r>
+      <w:r>
+        <w:t>Odunc tablosunda KitapID eşleşen kitaplar için t</w:t>
+      </w:r>
+      <w:r>
+        <w:t>eslim edilmiş ödünç kayıtlarını</w:t>
+      </w:r>
+    </w:p>
+    <w:p>
+      <w:pPr>
+        <w:spacing w:after="0" w:line="240" w:lineRule="auto"/>
+        <w:ind w:firstLine="720"/>
+      </w:pPr>
+      <w:r>
+        <w:t>(GercekTeslimTarih IS NOT NULL) sayar.</w:t>
+      </w:r>
+    </w:p>
+    <w:p>
+      <w:pPr>
+        <w:spacing w:after="0" w:line="240" w:lineRule="auto"/>
+        <w:ind w:firstLine="720"/>
+      </w:pPr>
+      <w:r>
+        <w:t xml:space="preserve">-- Kitap tablosundaki her kitap için, teslim edilmiş ödünç kayıtlarının var olup olmadığını kontrol </w:t>
+      </w:r>
+    </w:p>
+    <w:p>
+      <w:pPr>
+        <w:spacing w:after="0" w:line="240" w:lineRule="auto"/>
+        <w:ind w:firstLine="720"/>
+      </w:pPr>
+      <w:r>
+        <w:t>eder. Eğer teslim edilmiş kayıtlar varsa, sadece bu kitapların Adet sütunu güncellenir.</w:t>
+      </w:r>
+    </w:p>
+    <w:p>
+      <w:pPr>
+        <w:spacing w:after="0" w:line="240" w:lineRule="auto"/>
+        <w:ind w:firstLine="720"/>
+      </w:pPr>
+    </w:p>
+    <w:p>
+      <w:pPr>
+        <w:pStyle w:val="ListeParagraf"/>
+        <w:numPr>
+          <w:ilvl w:val="0"/>
+          <w:numId w:val="17"/>
+        </w:numPr>
+        <w:spacing w:after="0" w:line="240" w:lineRule="auto"/>
+      </w:pPr>
+      <w:r>
+        <w:t>Belirtilen tarih aralığında işe başlayan personelleri listeler.</w:t>
+      </w:r>
+    </w:p>
+    <w:p>
+      <w:pPr>
+        <w:pStyle w:val="ListeParagraf"/>
+        <w:numPr>
+          <w:ilvl w:val="1"/>
+          <w:numId w:val="17"/>
+        </w:numPr>
+        <w:spacing w:after="0" w:line="240" w:lineRule="auto"/>
+      </w:pPr>
+      <w:r>
+        <w:t>SELECT PerAdi || ' ' || PerSoyad AS Personel, IsBaslamaTarih FROM Personel</w:t>
+      </w:r>
+    </w:p>
+    <w:p>
+      <w:pPr>
+        <w:spacing w:after="0" w:line="240" w:lineRule="auto"/>
+        <w:ind w:left="1080" w:firstLine="360"/>
+      </w:pPr>
+      <w:r>
+        <w:t>WHERE IsBaslamaTarih BETWEEN '2020-01-01' AND '2024-12-31'</w:t>
+      </w:r>
+    </w:p>
+    <w:p>
+      <w:pPr>
+        <w:spacing w:after="0" w:line="240" w:lineRule="auto"/>
+        <w:ind w:left="1080" w:firstLine="360"/>
+      </w:pPr>
+      <w:r>
+        <w:t>ORDER BY IsBaslamaTarih ASC;</w:t>
+      </w:r>
+    </w:p>
+    <w:p>
+      <w:pPr>
+        <w:spacing w:after="0" w:line="240" w:lineRule="auto"/>
+      </w:pPr>
+    </w:p>
+    <w:p>
+      <w:pPr>
+        <w:spacing w:after="0" w:line="240" w:lineRule="auto"/>
+      </w:pPr>
+      <w:r>
+        <w:tab/>
+        <w:t xml:space="preserve">-- </w:t>
+      </w:r>
+      <w:r>
+        <w:t>Her personelin tam adı ve işe başlama tarihi gösterilir.</w:t>
+      </w:r>
+    </w:p>
+    <w:p>
+      <w:pPr>
+        <w:spacing w:after="0" w:line="240" w:lineRule="auto"/>
+      </w:pPr>
+      <w:r>
+        <w:tab/>
+        <w:t xml:space="preserve">-- </w:t>
+      </w:r>
+      <w:r>
+        <w:t>Sonuçlar işe başlama tarihine göre artan sırayla sıralanır.</w:t>
+      </w:r>
+    </w:p>
+    <w:p>
+      <w:pPr>
+        <w:spacing w:after="0" w:line="240" w:lineRule="auto"/>
+      </w:pPr>
+    </w:p>
+    <w:p>
+      <w:pPr>
+        <w:spacing w:after="0" w:line="240" w:lineRule="auto"/>
+      </w:pPr>
+      <w:r>
+        <w:tab/>
+      </w:r>
+      <w:r>
+        <w:rPr>
+          <w:noProof/>
+          <w:lang w:eastAsia="tr-TR"/>
+        </w:rPr>
+        <w:drawing>
+          <wp:inline distT="0" distB="0" distL="0" distR="0">
+            <wp:extent cx="2656840" cy="2795270"/>
+            <wp:effectExtent l="19050" t="0" r="0" b="0"/>
+            <wp:docPr id="7" name="Resim 7"/>
+            <wp:cNvGraphicFramePr>
+              <a:graphicFrameLocks xmlns:a="http://schemas.openxmlformats.org/drawingml/2006/main" noChangeAspect="1"/>
+            </wp:cNvGraphicFramePr>
+            <a:graphic xmlns:a="http://schemas.openxmlformats.org/drawingml/2006/main">
+              <a:graphicData uri="http://schemas.openxmlformats.org/drawingml/2006/picture">
+                <pic:pic xmlns:pic="http://schemas.openxmlformats.org/drawingml/2006/picture">
+                  <pic:nvPicPr>
+                    <pic:cNvPr id="0" name="Picture 7"/>
+                    <pic:cNvPicPr>
+                      <a:picLocks noChangeAspect="1" noChangeArrowheads="1"/>
+                    </pic:cNvPicPr>
+                  </pic:nvPicPr>
+                  <pic:blipFill>
+                    <a:blip r:embed="rId11"/>
+                    <a:srcRect/>
+                    <a:stretch>
+                      <a:fillRect/>
+                    </a:stretch>
+                  </pic:blipFill>
+                  <pic:spPr bwMode="auto">
+                    <a:xfrm>
+                      <a:off x="0" y="0"/>
+                      <a:ext cx="2656840" cy="2795270"/>
+                    </a:xfrm>
+                    <a:prstGeom prst="rect">
+                      <a:avLst/>
+                    </a:prstGeom>
+                    <a:noFill/>
+                    <a:ln w="9525">
+                      <a:noFill/>
+                      <a:miter lim="800000"/>
+                      <a:headEnd/>
+                      <a:tailEnd/>
+                    </a:ln>
+                  </pic:spPr>
+                </pic:pic>
+              </a:graphicData>
+            </a:graphic>
+          </wp:inline>
+        </w:drawing>
+      </w:r>
+    </w:p>
+    <w:p>
+      <w:pPr>
+        <w:spacing w:after="0" w:line="240" w:lineRule="auto"/>
+      </w:pPr>
+    </w:p>
+    <w:p>
+      <w:pPr>
+        <w:spacing w:after="0" w:line="240" w:lineRule="auto"/>
+      </w:pPr>
+    </w:p>
+    <w:p>
+      <w:pPr>
+        <w:spacing w:after="0" w:line="240" w:lineRule="auto"/>
+      </w:pPr>
+    </w:p>
+    <w:p>
+      <w:pPr>
+        <w:pStyle w:val="ListeParagraf"/>
+        <w:numPr>
+          <w:ilvl w:val="0"/>
+          <w:numId w:val="17"/>
+        </w:numPr>
+        <w:spacing w:after="0" w:line="240" w:lineRule="auto"/>
+      </w:pPr>
+      <w:r>
+        <w:lastRenderedPageBreak/>
+        <w:t>Bu sorgu, her RafNo için toplam kitap adedini</w:t>
+      </w:r>
+      <w:r>
+        <w:t xml:space="preserve"> listeler.</w:t>
+      </w:r>
+    </w:p>
+    <w:p>
+      <w:pPr>
+        <w:pStyle w:val="ListeParagraf"/>
+        <w:numPr>
+          <w:ilvl w:val="1"/>
+          <w:numId w:val="17"/>
+        </w:numPr>
+        <w:spacing w:after="0" w:line="240" w:lineRule="auto"/>
+      </w:pPr>
+      <w:r>
+        <w:t>SELECT R.RafNo AS RafNumarasi, SUM(K.Adet) AS ToplamKitapAdeti FROM Raf R</w:t>
+      </w:r>
+    </w:p>
+    <w:p>
+      <w:pPr>
+        <w:spacing w:after="0" w:line="240" w:lineRule="auto"/>
+        <w:ind w:left="1080" w:firstLine="360"/>
+      </w:pPr>
+      <w:r>
+        <w:t>INNER JOIN Kitap K ON R.RafNo = K.RafNo</w:t>
+      </w:r>
+    </w:p>
+    <w:p>
+      <w:pPr>
+        <w:spacing w:after="0" w:line="240" w:lineRule="auto"/>
+        <w:ind w:left="1080" w:firstLine="360"/>
+      </w:pPr>
+      <w:r>
+        <w:t>GROUP BY R.RafNo</w:t>
+      </w:r>
+    </w:p>
+    <w:p>
+      <w:pPr>
+        <w:spacing w:after="0" w:line="240" w:lineRule="auto"/>
+        <w:ind w:left="1080" w:firstLine="360"/>
+      </w:pPr>
+      <w:r>
+        <w:t>HAVING SUM(K.Adet) &gt; 0</w:t>
+      </w:r>
+    </w:p>
+    <w:p>
+      <w:pPr>
+        <w:spacing w:after="0" w:line="240" w:lineRule="auto"/>
+        <w:ind w:left="1080" w:firstLine="360"/>
+      </w:pPr>
+      <w:r>
+        <w:t>ORDER BY ToplamKitapAdeti DESC;</w:t>
+      </w:r>
+    </w:p>
+    <w:p>
+      <w:pPr>
+        <w:spacing w:after="0" w:line="240" w:lineRule="auto"/>
+      </w:pPr>
+      <w:r>
+        <w:tab/>
+      </w:r>
+    </w:p>
+    <w:p>
+      <w:pPr>
+        <w:spacing w:after="0" w:line="240" w:lineRule="auto"/>
+      </w:pPr>
+      <w:r>
+        <w:tab/>
+        <w:t xml:space="preserve">-- </w:t>
+      </w:r>
+      <w:r>
+        <w:t>Raf numarasını seçiyor ve bunu "RafNumarasi" olarak adlandırıyor</w:t>
+      </w:r>
+      <w:r>
+        <w:t xml:space="preserve">. Her raf için kitap adedinin </w:t>
+      </w:r>
+    </w:p>
+    <w:p>
+      <w:pPr>
+        <w:spacing w:after="0" w:line="240" w:lineRule="auto"/>
+        <w:ind w:firstLine="720"/>
+      </w:pPr>
+      <w:r>
+        <w:t>toplamını hesaplıyor ve bunu "ToplamKitapAdeti" olarak adlandırıyor.</w:t>
+      </w:r>
+      <w:r>
+        <w:t xml:space="preserve"> Raf tablosundan veri </w:t>
+      </w:r>
+    </w:p>
+    <w:p>
+      <w:pPr>
+        <w:spacing w:after="0" w:line="240" w:lineRule="auto"/>
+        <w:ind w:firstLine="720"/>
+      </w:pPr>
+      <w:r>
+        <w:t>alıyor ve bu tabloyu kısaca R olarak isimlendiriyor.</w:t>
+      </w:r>
+    </w:p>
+    <w:p>
+      <w:pPr>
+        <w:spacing w:after="0" w:line="240" w:lineRule="auto"/>
+        <w:ind w:left="720"/>
+      </w:pPr>
+      <w:r>
+        <w:t>--</w:t>
+      </w:r>
+      <w:r>
+        <w:t xml:space="preserve"> Raf tablosunu, Kitap tablosuyla birleştiriyor</w:t>
+      </w:r>
+      <w:r>
+        <w:t xml:space="preserve">. </w:t>
+      </w:r>
+      <w:r>
+        <w:t>Eşleştirme, her iki tablodaki RafNo değerleri üzerinden yapılıyor.</w:t>
+      </w:r>
+    </w:p>
+    <w:p>
+      <w:pPr>
+        <w:spacing w:after="0" w:line="240" w:lineRule="auto"/>
+        <w:ind w:left="720"/>
+      </w:pPr>
+      <w:r>
+        <w:t xml:space="preserve">-- </w:t>
+      </w:r>
+      <w:r>
+        <w:t>RafNo değerine göre verileri gruplandırıyor.Böylece her bir raf için toplam kitap adedi hesaplanabiliyor.</w:t>
+      </w:r>
+    </w:p>
+    <w:p>
+      <w:pPr>
+        <w:spacing w:after="0" w:line="240" w:lineRule="auto"/>
+        <w:ind w:left="720"/>
+      </w:pPr>
+      <w:r>
+        <w:t xml:space="preserve">-- </w:t>
+      </w:r>
+      <w:r>
+        <w:t>Toplam kitap adedi sıfırdan büyük olan rafları filtreliyor.Yani, boş rafları listeye dahil etmiyor.</w:t>
+      </w:r>
+    </w:p>
+    <w:p>
+      <w:pPr>
+        <w:spacing w:after="0" w:line="240" w:lineRule="auto"/>
+        <w:ind w:left="720"/>
+      </w:pPr>
+      <w:r>
+        <w:t xml:space="preserve">-- </w:t>
+      </w:r>
+      <w:r>
+        <w:t>Toplam kitap adedine göre verileri azalan sırada sıralıyor.Böylece, en fazla kitabı olan raf en üstte listeleniyor.</w:t>
+      </w:r>
+    </w:p>
+    <w:p>
+      <w:pPr>
+        <w:spacing w:after="0" w:line="240" w:lineRule="auto"/>
+        <w:ind w:left="1080" w:firstLine="360"/>
+      </w:pPr>
+    </w:p>
+    <w:p>
+      <w:pPr>
+        <w:spacing w:after="0" w:line="240" w:lineRule="auto"/>
+        <w:ind w:left="1080" w:firstLine="360"/>
+      </w:pPr>
+    </w:p>
+    <w:p>
+      <w:pPr>
+        <w:spacing w:after="0" w:line="240" w:lineRule="auto"/>
+        <w:ind w:left="1080" w:firstLine="360"/>
+      </w:pPr>
+      <w:r>
+        <w:rPr>
+          <w:noProof/>
+          <w:lang w:eastAsia="tr-TR"/>
+        </w:rPr>
+        <w:drawing>
+          <wp:inline distT="0" distB="0" distL="0" distR="0">
+            <wp:extent cx="3105785" cy="2545080"/>
+            <wp:effectExtent l="19050" t="0" r="0" b="0"/>
+            <wp:docPr id="10" name="Resim 10"/>
+            <wp:cNvGraphicFramePr>
+              <a:graphicFrameLocks xmlns:a="http://schemas.openxmlformats.org/drawingml/2006/main" noChangeAspect="1"/>
+            </wp:cNvGraphicFramePr>
+            <a:graphic xmlns:a="http://schemas.openxmlformats.org/drawingml/2006/main">
+              <a:graphicData uri="http://schemas.openxmlformats.org/drawingml/2006/picture">
+                <pic:pic xmlns:pic="http://schemas.openxmlformats.org/drawingml/2006/picture">
+                  <pic:nvPicPr>
+                    <pic:cNvPr id="0" name="Picture 10"/>
+                    <pic:cNvPicPr>
+                      <a:picLocks noChangeAspect="1" noChangeArrowheads="1"/>
+                    </pic:cNvPicPr>
+                  </pic:nvPicPr>
+                  <pic:blipFill>
+                    <a:blip r:embed="rId12"/>
+                    <a:srcRect/>
+                    <a:stretch>
+                      <a:fillRect/>
+                    </a:stretch>
+                  </pic:blipFill>
+                  <pic:spPr bwMode="auto">
+                    <a:xfrm>
+                      <a:off x="0" y="0"/>
+                      <a:ext cx="3105785" cy="2545080"/>
+                    </a:xfrm>
+                    <a:prstGeom prst="rect">
+                      <a:avLst/>
+                    </a:prstGeom>
+                    <a:noFill/>
+                    <a:ln w="9525">
+                      <a:noFill/>
+                      <a:miter lim="800000"/>
+                      <a:headEnd/>
+                      <a:tailEnd/>
+                    </a:ln>
+                  </pic:spPr>
+                </pic:pic>
+              </a:graphicData>
+            </a:graphic>
+          </wp:inline>
+        </w:drawing>
+      </w:r>
+    </w:p>
     <w:sectPr>
-      <w:footerReference w:type="even" r:id="rId9"/>
-      <w:footerReference w:type="default" r:id="rId10"/>
+      <w:footerReference w:type="even" r:id="rId13"/>
+      <w:footerReference w:type="default" r:id="rId14"/>
       <w:pgSz w:w="12240" w:h="15840"/>
       <w:pgMar w:top="1440" w:right="1440" w:bottom="1440" w:left="1440" w:header="720" w:footer="720" w:gutter="0"/>
       <w:cols w:space="720"/>
@@ -913,7 +2143,7 @@
             <w:rStyle w:val="SayfaNumaras"/>
             <w:noProof/>
           </w:rPr>
-          <w:t>1</w:t>
+          <w:t>5</w:t>
         </w:r>
         <w:r>
           <w:rPr>
@@ -961,6 +2191,232 @@
 <file path=word/numbering.xml><?xml version="1.0" encoding="utf-8"?>
 <w:numbering xmlns:ve="http://schemas.openxmlformats.org/markup-compatibility/2006" xmlns:o="urn:schemas-microsoft-com:office:office" xmlns:r="http://schemas.openxmlformats.org/officeDocument/2006/relationships" xmlns:m="http://schemas.openxmlformats.org/officeDocument/2006/math" xmlns:v="urn:schemas-microsoft-com:vml" xmlns:wp="http://schemas.openxmlformats.org/drawingml/2006/wordprocessingDrawing" xmlns:w10="urn:schemas-microsoft-com:office:word" xmlns:w="http://schemas.openxmlformats.org/wordprocessingml/2006/main" xmlns:wne="http://schemas.microsoft.com/office/word/2006/wordml">
   <w:abstractNum w:abstractNumId="0">
+    <w:nsid w:val="070C0724"/>
+    <w:multiLevelType w:val="hybridMultilevel"/>
+    <w:tmpl w:val="3A4A8122"/>
+    <w:lvl w:ilvl="0" w:tplc="041F0001">
+      <w:start w:val="1"/>
+      <w:numFmt w:val="bullet"/>
+      <w:lvlText w:val=""/>
+      <w:lvlJc w:val="left"/>
+      <w:pPr>
+        <w:ind w:left="2160" w:hanging="360"/>
+      </w:pPr>
+      <w:rPr>
+        <w:rFonts w:ascii="Symbol" w:hAnsi="Symbol" w:hint="default"/>
+      </w:rPr>
+    </w:lvl>
+    <w:lvl w:ilvl="1" w:tplc="041F0003" w:tentative="1">
+      <w:start w:val="1"/>
+      <w:numFmt w:val="bullet"/>
+      <w:lvlText w:val="o"/>
+      <w:lvlJc w:val="left"/>
+      <w:pPr>
+        <w:ind w:left="2880" w:hanging="360"/>
+      </w:pPr>
+      <w:rPr>
+        <w:rFonts w:ascii="Courier New" w:hAnsi="Courier New" w:cs="Courier New" w:hint="default"/>
+      </w:rPr>
+    </w:lvl>
+    <w:lvl w:ilvl="2" w:tplc="041F0005" w:tentative="1">
+      <w:start w:val="1"/>
+      <w:numFmt w:val="bullet"/>
+      <w:lvlText w:val=""/>
+      <w:lvlJc w:val="left"/>
+      <w:pPr>
+        <w:ind w:left="3600" w:hanging="360"/>
+      </w:pPr>
+      <w:rPr>
+        <w:rFonts w:ascii="Wingdings" w:hAnsi="Wingdings" w:hint="default"/>
+      </w:rPr>
+    </w:lvl>
+    <w:lvl w:ilvl="3" w:tplc="041F0001" w:tentative="1">
+      <w:start w:val="1"/>
+      <w:numFmt w:val="bullet"/>
+      <w:lvlText w:val=""/>
+      <w:lvlJc w:val="left"/>
+      <w:pPr>
+        <w:ind w:left="4320" w:hanging="360"/>
+      </w:pPr>
+      <w:rPr>
+        <w:rFonts w:ascii="Symbol" w:hAnsi="Symbol" w:hint="default"/>
+      </w:rPr>
+    </w:lvl>
+    <w:lvl w:ilvl="4" w:tplc="041F0003" w:tentative="1">
+      <w:start w:val="1"/>
+      <w:numFmt w:val="bullet"/>
+      <w:lvlText w:val="o"/>
+      <w:lvlJc w:val="left"/>
+      <w:pPr>
+        <w:ind w:left="5040" w:hanging="360"/>
+      </w:pPr>
+      <w:rPr>
+        <w:rFonts w:ascii="Courier New" w:hAnsi="Courier New" w:cs="Courier New" w:hint="default"/>
+      </w:rPr>
+    </w:lvl>
+    <w:lvl w:ilvl="5" w:tplc="041F0005" w:tentative="1">
+      <w:start w:val="1"/>
+      <w:numFmt w:val="bullet"/>
+      <w:lvlText w:val=""/>
+      <w:lvlJc w:val="left"/>
+      <w:pPr>
+        <w:ind w:left="5760" w:hanging="360"/>
+      </w:pPr>
+      <w:rPr>
+        <w:rFonts w:ascii="Wingdings" w:hAnsi="Wingdings" w:hint="default"/>
+      </w:rPr>
+    </w:lvl>
+    <w:lvl w:ilvl="6" w:tplc="041F0001" w:tentative="1">
+      <w:start w:val="1"/>
+      <w:numFmt w:val="bullet"/>
+      <w:lvlText w:val=""/>
+      <w:lvlJc w:val="left"/>
+      <w:pPr>
+        <w:ind w:left="6480" w:hanging="360"/>
+      </w:pPr>
+      <w:rPr>
+        <w:rFonts w:ascii="Symbol" w:hAnsi="Symbol" w:hint="default"/>
+      </w:rPr>
+    </w:lvl>
+    <w:lvl w:ilvl="7" w:tplc="041F0003" w:tentative="1">
+      <w:start w:val="1"/>
+      <w:numFmt w:val="bullet"/>
+      <w:lvlText w:val="o"/>
+      <w:lvlJc w:val="left"/>
+      <w:pPr>
+        <w:ind w:left="7200" w:hanging="360"/>
+      </w:pPr>
+      <w:rPr>
+        <w:rFonts w:ascii="Courier New" w:hAnsi="Courier New" w:cs="Courier New" w:hint="default"/>
+      </w:rPr>
+    </w:lvl>
+    <w:lvl w:ilvl="8" w:tplc="041F0005" w:tentative="1">
+      <w:start w:val="1"/>
+      <w:numFmt w:val="bullet"/>
+      <w:lvlText w:val=""/>
+      <w:lvlJc w:val="left"/>
+      <w:pPr>
+        <w:ind w:left="7920" w:hanging="360"/>
+      </w:pPr>
+      <w:rPr>
+        <w:rFonts w:ascii="Wingdings" w:hAnsi="Wingdings" w:hint="default"/>
+      </w:rPr>
+    </w:lvl>
+  </w:abstractNum>
+  <w:abstractNum w:abstractNumId="1">
+    <w:nsid w:val="0DAA6F3C"/>
+    <w:multiLevelType w:val="hybridMultilevel"/>
+    <w:tmpl w:val="588AF8CE"/>
+    <w:lvl w:ilvl="0" w:tplc="041F0001">
+      <w:start w:val="1"/>
+      <w:numFmt w:val="bullet"/>
+      <w:lvlText w:val=""/>
+      <w:lvlJc w:val="left"/>
+      <w:pPr>
+        <w:ind w:left="1440" w:hanging="360"/>
+      </w:pPr>
+      <w:rPr>
+        <w:rFonts w:ascii="Symbol" w:hAnsi="Symbol" w:hint="default"/>
+      </w:rPr>
+    </w:lvl>
+    <w:lvl w:ilvl="1" w:tplc="041F0003" w:tentative="1">
+      <w:start w:val="1"/>
+      <w:numFmt w:val="bullet"/>
+      <w:lvlText w:val="o"/>
+      <w:lvlJc w:val="left"/>
+      <w:pPr>
+        <w:ind w:left="2160" w:hanging="360"/>
+      </w:pPr>
+      <w:rPr>
+        <w:rFonts w:ascii="Courier New" w:hAnsi="Courier New" w:cs="Courier New" w:hint="default"/>
+      </w:rPr>
+    </w:lvl>
+    <w:lvl w:ilvl="2" w:tplc="041F0005" w:tentative="1">
+      <w:start w:val="1"/>
+      <w:numFmt w:val="bullet"/>
+      <w:lvlText w:val=""/>
+      <w:lvlJc w:val="left"/>
+      <w:pPr>
+        <w:ind w:left="2880" w:hanging="360"/>
+      </w:pPr>
+      <w:rPr>
+        <w:rFonts w:ascii="Wingdings" w:hAnsi="Wingdings" w:hint="default"/>
+      </w:rPr>
+    </w:lvl>
+    <w:lvl w:ilvl="3" w:tplc="041F0001" w:tentative="1">
+      <w:start w:val="1"/>
+      <w:numFmt w:val="bullet"/>
+      <w:lvlText w:val=""/>
+      <w:lvlJc w:val="left"/>
+      <w:pPr>
+        <w:ind w:left="3600" w:hanging="360"/>
+      </w:pPr>
+      <w:rPr>
+        <w:rFonts w:ascii="Symbol" w:hAnsi="Symbol" w:hint="default"/>
+      </w:rPr>
+    </w:lvl>
+    <w:lvl w:ilvl="4" w:tplc="041F0003" w:tentative="1">
+      <w:start w:val="1"/>
+      <w:numFmt w:val="bullet"/>
+      <w:lvlText w:val="o"/>
+      <w:lvlJc w:val="left"/>
+      <w:pPr>
+        <w:ind w:left="4320" w:hanging="360"/>
+      </w:pPr>
+      <w:rPr>
+        <w:rFonts w:ascii="Courier New" w:hAnsi="Courier New" w:cs="Courier New" w:hint="default"/>
+      </w:rPr>
+    </w:lvl>
+    <w:lvl w:ilvl="5" w:tplc="041F0005" w:tentative="1">
+      <w:start w:val="1"/>
+      <w:numFmt w:val="bullet"/>
+      <w:lvlText w:val=""/>
+      <w:lvlJc w:val="left"/>
+      <w:pPr>
+        <w:ind w:left="5040" w:hanging="360"/>
+      </w:pPr>
+      <w:rPr>
+        <w:rFonts w:ascii="Wingdings" w:hAnsi="Wingdings" w:hint="default"/>
+      </w:rPr>
+    </w:lvl>
+    <w:lvl w:ilvl="6" w:tplc="041F0001" w:tentative="1">
+      <w:start w:val="1"/>
+      <w:numFmt w:val="bullet"/>
+      <w:lvlText w:val=""/>
+      <w:lvlJc w:val="left"/>
+      <w:pPr>
+        <w:ind w:left="5760" w:hanging="360"/>
+      </w:pPr>
+      <w:rPr>
+        <w:rFonts w:ascii="Symbol" w:hAnsi="Symbol" w:hint="default"/>
+      </w:rPr>
+    </w:lvl>
+    <w:lvl w:ilvl="7" w:tplc="041F0003" w:tentative="1">
+      <w:start w:val="1"/>
+      <w:numFmt w:val="bullet"/>
+      <w:lvlText w:val="o"/>
+      <w:lvlJc w:val="left"/>
+      <w:pPr>
+        <w:ind w:left="6480" w:hanging="360"/>
+      </w:pPr>
+      <w:rPr>
+        <w:rFonts w:ascii="Courier New" w:hAnsi="Courier New" w:cs="Courier New" w:hint="default"/>
+      </w:rPr>
+    </w:lvl>
+    <w:lvl w:ilvl="8" w:tplc="041F0005" w:tentative="1">
+      <w:start w:val="1"/>
+      <w:numFmt w:val="bullet"/>
+      <w:lvlText w:val=""/>
+      <w:lvlJc w:val="left"/>
+      <w:pPr>
+        <w:ind w:left="7200" w:hanging="360"/>
+      </w:pPr>
+      <w:rPr>
+        <w:rFonts w:ascii="Wingdings" w:hAnsi="Wingdings" w:hint="default"/>
+      </w:rPr>
+    </w:lvl>
+  </w:abstractNum>
+  <w:abstractNum w:abstractNumId="2">
     <w:nsid w:val="2091011D"/>
     <w:multiLevelType w:val="hybridMultilevel"/>
     <w:tmpl w:val="B5086E42"/>
@@ -1073,7 +2529,7 @@
       </w:rPr>
     </w:lvl>
   </w:abstractNum>
-  <w:abstractNum w:abstractNumId="1">
+  <w:abstractNum w:abstractNumId="3">
     <w:nsid w:val="2A2D3F19"/>
     <w:multiLevelType w:val="hybridMultilevel"/>
     <w:tmpl w:val="D2A6C08E"/>
@@ -1159,7 +2615,7 @@
       </w:pPr>
     </w:lvl>
   </w:abstractNum>
-  <w:abstractNum w:abstractNumId="2">
+  <w:abstractNum w:abstractNumId="4">
     <w:nsid w:val="2A9C5E9F"/>
     <w:multiLevelType w:val="hybridMultilevel"/>
     <w:tmpl w:val="95A09C14"/>
@@ -1245,7 +2701,7 @@
       </w:pPr>
     </w:lvl>
   </w:abstractNum>
-  <w:abstractNum w:abstractNumId="3">
+  <w:abstractNum w:abstractNumId="5">
     <w:nsid w:val="2FA0585D"/>
     <w:multiLevelType w:val="hybridMultilevel"/>
     <w:tmpl w:val="E8886D04"/>
@@ -1358,7 +2814,7 @@
       </w:rPr>
     </w:lvl>
   </w:abstractNum>
-  <w:abstractNum w:abstractNumId="4">
+  <w:abstractNum w:abstractNumId="6">
     <w:nsid w:val="3A980920"/>
     <w:multiLevelType w:val="hybridMultilevel"/>
     <w:tmpl w:val="B5645EC8"/>
@@ -1471,7 +2927,7 @@
       </w:rPr>
     </w:lvl>
   </w:abstractNum>
-  <w:abstractNum w:abstractNumId="5">
+  <w:abstractNum w:abstractNumId="7">
     <w:nsid w:val="3EAC0FA0"/>
     <w:multiLevelType w:val="hybridMultilevel"/>
     <w:tmpl w:val="698820BA"/>
@@ -1500,7 +2956,7 @@
         <w:rFonts w:ascii="Symbol" w:hAnsi="Symbol" w:hint="default"/>
       </w:rPr>
     </w:lvl>
-    <w:lvl w:ilvl="2" w:tplc="0409001B" w:tentative="1">
+    <w:lvl w:ilvl="2" w:tplc="0409001B">
       <w:start w:val="1"/>
       <w:numFmt w:val="lowerRoman"/>
       <w:lvlText w:val="%3."/>
@@ -1564,7 +3020,7 @@
       </w:pPr>
     </w:lvl>
   </w:abstractNum>
-  <w:abstractNum w:abstractNumId="6">
+  <w:abstractNum w:abstractNumId="8">
     <w:nsid w:val="3F877092"/>
     <w:multiLevelType w:val="hybridMultilevel"/>
     <w:tmpl w:val="E7D0D674"/>
@@ -1677,7 +3133,7 @@
       </w:rPr>
     </w:lvl>
   </w:abstractNum>
-  <w:abstractNum w:abstractNumId="7">
+  <w:abstractNum w:abstractNumId="9">
     <w:nsid w:val="455E743B"/>
     <w:multiLevelType w:val="hybridMultilevel"/>
     <w:tmpl w:val="B5645EC8"/>
@@ -1790,7 +3246,7 @@
       </w:rPr>
     </w:lvl>
   </w:abstractNum>
-  <w:abstractNum w:abstractNumId="8">
+  <w:abstractNum w:abstractNumId="10">
     <w:nsid w:val="47292905"/>
     <w:multiLevelType w:val="hybridMultilevel"/>
     <w:tmpl w:val="A4D4FAA2"/>
@@ -1876,7 +3332,7 @@
       </w:pPr>
     </w:lvl>
   </w:abstractNum>
-  <w:abstractNum w:abstractNumId="9">
+  <w:abstractNum w:abstractNumId="11">
     <w:nsid w:val="473C7A55"/>
     <w:multiLevelType w:val="hybridMultilevel"/>
     <w:tmpl w:val="AE0465E2"/>
@@ -1989,7 +3445,7 @@
       </w:rPr>
     </w:lvl>
   </w:abstractNum>
-  <w:abstractNum w:abstractNumId="10">
+  <w:abstractNum w:abstractNumId="12">
     <w:nsid w:val="51742478"/>
     <w:multiLevelType w:val="hybridMultilevel"/>
     <w:tmpl w:val="B122E23A"/>
@@ -2102,7 +3558,120 @@
       </w:rPr>
     </w:lvl>
   </w:abstractNum>
-  <w:abstractNum w:abstractNumId="11">
+  <w:abstractNum w:abstractNumId="13">
+    <w:nsid w:val="57285F2B"/>
+    <w:multiLevelType w:val="hybridMultilevel"/>
+    <w:tmpl w:val="74C29DB4"/>
+    <w:lvl w:ilvl="0" w:tplc="041F0001">
+      <w:start w:val="1"/>
+      <w:numFmt w:val="bullet"/>
+      <w:lvlText w:val=""/>
+      <w:lvlJc w:val="left"/>
+      <w:pPr>
+        <w:ind w:left="1080" w:hanging="360"/>
+      </w:pPr>
+      <w:rPr>
+        <w:rFonts w:ascii="Symbol" w:hAnsi="Symbol" w:hint="default"/>
+      </w:rPr>
+    </w:lvl>
+    <w:lvl w:ilvl="1" w:tplc="041F0003" w:tentative="1">
+      <w:start w:val="1"/>
+      <w:numFmt w:val="bullet"/>
+      <w:lvlText w:val="o"/>
+      <w:lvlJc w:val="left"/>
+      <w:pPr>
+        <w:ind w:left="1800" w:hanging="360"/>
+      </w:pPr>
+      <w:rPr>
+        <w:rFonts w:ascii="Courier New" w:hAnsi="Courier New" w:cs="Courier New" w:hint="default"/>
+      </w:rPr>
+    </w:lvl>
+    <w:lvl w:ilvl="2" w:tplc="041F0005" w:tentative="1">
+      <w:start w:val="1"/>
+      <w:numFmt w:val="bullet"/>
+      <w:lvlText w:val=""/>
+      <w:lvlJc w:val="left"/>
+      <w:pPr>
+        <w:ind w:left="2520" w:hanging="360"/>
+      </w:pPr>
+      <w:rPr>
+        <w:rFonts w:ascii="Wingdings" w:hAnsi="Wingdings" w:hint="default"/>
+      </w:rPr>
+    </w:lvl>
+    <w:lvl w:ilvl="3" w:tplc="041F0001" w:tentative="1">
+      <w:start w:val="1"/>
+      <w:numFmt w:val="bullet"/>
+      <w:lvlText w:val=""/>
+      <w:lvlJc w:val="left"/>
+      <w:pPr>
+        <w:ind w:left="3240" w:hanging="360"/>
+      </w:pPr>
+      <w:rPr>
+        <w:rFonts w:ascii="Symbol" w:hAnsi="Symbol" w:hint="default"/>
+      </w:rPr>
+    </w:lvl>
+    <w:lvl w:ilvl="4" w:tplc="041F0003" w:tentative="1">
+      <w:start w:val="1"/>
+      <w:numFmt w:val="bullet"/>
+      <w:lvlText w:val="o"/>
+      <w:lvlJc w:val="left"/>
+      <w:pPr>
+        <w:ind w:left="3960" w:hanging="360"/>
+      </w:pPr>
+      <w:rPr>
+        <w:rFonts w:ascii="Courier New" w:hAnsi="Courier New" w:cs="Courier New" w:hint="default"/>
+      </w:rPr>
+    </w:lvl>
+    <w:lvl w:ilvl="5" w:tplc="041F0005" w:tentative="1">
+      <w:start w:val="1"/>
+      <w:numFmt w:val="bullet"/>
+      <w:lvlText w:val=""/>
+      <w:lvlJc w:val="left"/>
+      <w:pPr>
+        <w:ind w:left="4680" w:hanging="360"/>
+      </w:pPr>
+      <w:rPr>
+        <w:rFonts w:ascii="Wingdings" w:hAnsi="Wingdings" w:hint="default"/>
+      </w:rPr>
+    </w:lvl>
+    <w:lvl w:ilvl="6" w:tplc="041F0001" w:tentative="1">
+      <w:start w:val="1"/>
+      <w:numFmt w:val="bullet"/>
+      <w:lvlText w:val=""/>
+      <w:lvlJc w:val="left"/>
+      <w:pPr>
+        <w:ind w:left="5400" w:hanging="360"/>
+      </w:pPr>
+      <w:rPr>
+        <w:rFonts w:ascii="Symbol" w:hAnsi="Symbol" w:hint="default"/>
+      </w:rPr>
+    </w:lvl>
+    <w:lvl w:ilvl="7" w:tplc="041F0003" w:tentative="1">
+      <w:start w:val="1"/>
+      <w:numFmt w:val="bullet"/>
+      <w:lvlText w:val="o"/>
+      <w:lvlJc w:val="left"/>
+      <w:pPr>
+        <w:ind w:left="6120" w:hanging="360"/>
+      </w:pPr>
+      <w:rPr>
+        <w:rFonts w:ascii="Courier New" w:hAnsi="Courier New" w:cs="Courier New" w:hint="default"/>
+      </w:rPr>
+    </w:lvl>
+    <w:lvl w:ilvl="8" w:tplc="041F0005" w:tentative="1">
+      <w:start w:val="1"/>
+      <w:numFmt w:val="bullet"/>
+      <w:lvlText w:val=""/>
+      <w:lvlJc w:val="left"/>
+      <w:pPr>
+        <w:ind w:left="6840" w:hanging="360"/>
+      </w:pPr>
+      <w:rPr>
+        <w:rFonts w:ascii="Wingdings" w:hAnsi="Wingdings" w:hint="default"/>
+      </w:rPr>
+    </w:lvl>
+  </w:abstractNum>
+  <w:abstractNum w:abstractNumId="14">
     <w:nsid w:val="608C385D"/>
     <w:multiLevelType w:val="hybridMultilevel"/>
     <w:tmpl w:val="E9003612"/>
@@ -2215,7 +3784,7 @@
       </w:rPr>
     </w:lvl>
   </w:abstractNum>
-  <w:abstractNum w:abstractNumId="12">
+  <w:abstractNum w:abstractNumId="15">
     <w:nsid w:val="63CB2BAE"/>
     <w:multiLevelType w:val="hybridMultilevel"/>
     <w:tmpl w:val="EB4A1F70"/>
@@ -2328,7 +3897,7 @@
       </w:rPr>
     </w:lvl>
   </w:abstractNum>
-  <w:abstractNum w:abstractNumId="13">
+  <w:abstractNum w:abstractNumId="16">
     <w:nsid w:val="6D120F80"/>
     <w:multiLevelType w:val="hybridMultilevel"/>
     <w:tmpl w:val="C6540966"/>
@@ -2414,7 +3983,7 @@
       </w:pPr>
     </w:lvl>
   </w:abstractNum>
-  <w:abstractNum w:abstractNumId="14">
+  <w:abstractNum w:abstractNumId="17">
     <w:nsid w:val="6D274AD7"/>
     <w:multiLevelType w:val="hybridMultilevel"/>
     <w:tmpl w:val="C002B63C"/>
@@ -2500,7 +4069,120 @@
       </w:pPr>
     </w:lvl>
   </w:abstractNum>
-  <w:abstractNum w:abstractNumId="15">
+  <w:abstractNum w:abstractNumId="18">
+    <w:nsid w:val="6E15636C"/>
+    <w:multiLevelType w:val="hybridMultilevel"/>
+    <w:tmpl w:val="BEB4B8AC"/>
+    <w:lvl w:ilvl="0" w:tplc="041F0001">
+      <w:start w:val="1"/>
+      <w:numFmt w:val="bullet"/>
+      <w:lvlText w:val=""/>
+      <w:lvlJc w:val="left"/>
+      <w:pPr>
+        <w:ind w:left="1080" w:hanging="360"/>
+      </w:pPr>
+      <w:rPr>
+        <w:rFonts w:ascii="Symbol" w:hAnsi="Symbol" w:hint="default"/>
+      </w:rPr>
+    </w:lvl>
+    <w:lvl w:ilvl="1" w:tplc="041F0003" w:tentative="1">
+      <w:start w:val="1"/>
+      <w:numFmt w:val="bullet"/>
+      <w:lvlText w:val="o"/>
+      <w:lvlJc w:val="left"/>
+      <w:pPr>
+        <w:ind w:left="1800" w:hanging="360"/>
+      </w:pPr>
+      <w:rPr>
+        <w:rFonts w:ascii="Courier New" w:hAnsi="Courier New" w:cs="Courier New" w:hint="default"/>
+      </w:rPr>
+    </w:lvl>
+    <w:lvl w:ilvl="2" w:tplc="041F0005" w:tentative="1">
+      <w:start w:val="1"/>
+      <w:numFmt w:val="bullet"/>
+      <w:lvlText w:val=""/>
+      <w:lvlJc w:val="left"/>
+      <w:pPr>
+        <w:ind w:left="2520" w:hanging="360"/>
+      </w:pPr>
+      <w:rPr>
+        <w:rFonts w:ascii="Wingdings" w:hAnsi="Wingdings" w:hint="default"/>
+      </w:rPr>
+    </w:lvl>
+    <w:lvl w:ilvl="3" w:tplc="041F0001" w:tentative="1">
+      <w:start w:val="1"/>
+      <w:numFmt w:val="bullet"/>
+      <w:lvlText w:val=""/>
+      <w:lvlJc w:val="left"/>
+      <w:pPr>
+        <w:ind w:left="3240" w:hanging="360"/>
+      </w:pPr>
+      <w:rPr>
+        <w:rFonts w:ascii="Symbol" w:hAnsi="Symbol" w:hint="default"/>
+      </w:rPr>
+    </w:lvl>
+    <w:lvl w:ilvl="4" w:tplc="041F0003" w:tentative="1">
+      <w:start w:val="1"/>
+      <w:numFmt w:val="bullet"/>
+      <w:lvlText w:val="o"/>
+      <w:lvlJc w:val="left"/>
+      <w:pPr>
+        <w:ind w:left="3960" w:hanging="360"/>
+      </w:pPr>
+      <w:rPr>
+        <w:rFonts w:ascii="Courier New" w:hAnsi="Courier New" w:cs="Courier New" w:hint="default"/>
+      </w:rPr>
+    </w:lvl>
+    <w:lvl w:ilvl="5" w:tplc="041F0005" w:tentative="1">
+      <w:start w:val="1"/>
+      <w:numFmt w:val="bullet"/>
+      <w:lvlText w:val=""/>
+      <w:lvlJc w:val="left"/>
+      <w:pPr>
+        <w:ind w:left="4680" w:hanging="360"/>
+      </w:pPr>
+      <w:rPr>
+        <w:rFonts w:ascii="Wingdings" w:hAnsi="Wingdings" w:hint="default"/>
+      </w:rPr>
+    </w:lvl>
+    <w:lvl w:ilvl="6" w:tplc="041F0001" w:tentative="1">
+      <w:start w:val="1"/>
+      <w:numFmt w:val="bullet"/>
+      <w:lvlText w:val=""/>
+      <w:lvlJc w:val="left"/>
+      <w:pPr>
+        <w:ind w:left="5400" w:hanging="360"/>
+      </w:pPr>
+      <w:rPr>
+        <w:rFonts w:ascii="Symbol" w:hAnsi="Symbol" w:hint="default"/>
+      </w:rPr>
+    </w:lvl>
+    <w:lvl w:ilvl="7" w:tplc="041F0003" w:tentative="1">
+      <w:start w:val="1"/>
+      <w:numFmt w:val="bullet"/>
+      <w:lvlText w:val="o"/>
+      <w:lvlJc w:val="left"/>
+      <w:pPr>
+        <w:ind w:left="6120" w:hanging="360"/>
+      </w:pPr>
+      <w:rPr>
+        <w:rFonts w:ascii="Courier New" w:hAnsi="Courier New" w:cs="Courier New" w:hint="default"/>
+      </w:rPr>
+    </w:lvl>
+    <w:lvl w:ilvl="8" w:tplc="041F0005" w:tentative="1">
+      <w:start w:val="1"/>
+      <w:numFmt w:val="bullet"/>
+      <w:lvlText w:val=""/>
+      <w:lvlJc w:val="left"/>
+      <w:pPr>
+        <w:ind w:left="6840" w:hanging="360"/>
+      </w:pPr>
+      <w:rPr>
+        <w:rFonts w:ascii="Wingdings" w:hAnsi="Wingdings" w:hint="default"/>
+      </w:rPr>
+    </w:lvl>
+  </w:abstractNum>
+  <w:abstractNum w:abstractNumId="19">
     <w:nsid w:val="6E6F54DD"/>
     <w:multiLevelType w:val="hybridMultilevel"/>
     <w:tmpl w:val="CC5C6D6E"/>
@@ -2613,7 +4295,7 @@
       </w:rPr>
     </w:lvl>
   </w:abstractNum>
-  <w:abstractNum w:abstractNumId="16">
+  <w:abstractNum w:abstractNumId="20">
     <w:nsid w:val="72451ECC"/>
     <w:multiLevelType w:val="hybridMultilevel"/>
     <w:tmpl w:val="67EE73A4"/>
@@ -2700,55 +4382,67 @@
     </w:lvl>
   </w:abstractNum>
   <w:num w:numId="1">
+    <w:abstractNumId w:val="20"/>
+  </w:num>
+  <w:num w:numId="2">
+    <w:abstractNumId w:val="5"/>
+  </w:num>
+  <w:num w:numId="3">
+    <w:abstractNumId w:val="17"/>
+  </w:num>
+  <w:num w:numId="4">
+    <w:abstractNumId w:val="4"/>
+  </w:num>
+  <w:num w:numId="5">
+    <w:abstractNumId w:val="3"/>
+  </w:num>
+  <w:num w:numId="6">
+    <w:abstractNumId w:val="10"/>
+  </w:num>
+  <w:num w:numId="7">
+    <w:abstractNumId w:val="9"/>
+  </w:num>
+  <w:num w:numId="8">
+    <w:abstractNumId w:val="6"/>
+  </w:num>
+  <w:num w:numId="9">
     <w:abstractNumId w:val="16"/>
   </w:num>
-  <w:num w:numId="2">
-    <w:abstractNumId w:val="3"/>
-  </w:num>
-  <w:num w:numId="3">
+  <w:num w:numId="10">
     <w:abstractNumId w:val="14"/>
   </w:num>
-  <w:num w:numId="4">
+  <w:num w:numId="11">
     <w:abstractNumId w:val="2"/>
   </w:num>
-  <w:num w:numId="5">
-    <w:abstractNumId w:val="1"/>
+  <w:num w:numId="12">
+    <w:abstractNumId w:val="15"/>
   </w:num>
-  <w:num w:numId="6">
+  <w:num w:numId="13">
+    <w:abstractNumId w:val="12"/>
+  </w:num>
+  <w:num w:numId="14">
+    <w:abstractNumId w:val="11"/>
+  </w:num>
+  <w:num w:numId="15">
     <w:abstractNumId w:val="8"/>
   </w:num>
-  <w:num w:numId="7">
+  <w:num w:numId="16">
+    <w:abstractNumId w:val="19"/>
+  </w:num>
+  <w:num w:numId="17">
     <w:abstractNumId w:val="7"/>
   </w:num>
-  <w:num w:numId="8">
-    <w:abstractNumId w:val="4"/>
+  <w:num w:numId="18">
+    <w:abstractNumId w:val="0"/>
   </w:num>
-  <w:num w:numId="9">
+  <w:num w:numId="19">
     <w:abstractNumId w:val="13"/>
   </w:num>
-  <w:num w:numId="10">
-    <w:abstractNumId w:val="11"/>
+  <w:num w:numId="20">
+    <w:abstractNumId w:val="18"/>
   </w:num>
-  <w:num w:numId="11">
-    <w:abstractNumId w:val="0"/>
-  </w:num>
-  <w:num w:numId="12">
-    <w:abstractNumId w:val="12"/>
-  </w:num>
-  <w:num w:numId="13">
-    <w:abstractNumId w:val="10"/>
-  </w:num>
-  <w:num w:numId="14">
-    <w:abstractNumId w:val="9"/>
-  </w:num>
-  <w:num w:numId="15">
-    <w:abstractNumId w:val="6"/>
-  </w:num>
-  <w:num w:numId="16">
-    <w:abstractNumId w:val="15"/>
-  </w:num>
-  <w:num w:numId="17">
-    <w:abstractNumId w:val="5"/>
+  <w:num w:numId="21">
+    <w:abstractNumId w:val="1"/>
   </w:num>
 </w:numbering>
 </file>
@@ -2921,6 +4615,7 @@
   <w:style w:type="character" w:default="1" w:styleId="VarsaylanParagrafYazTipi">
     <w:name w:val="Default Paragraph Font"/>
     <w:uiPriority w:val="1"/>
+    <w:semiHidden/>
     <w:unhideWhenUsed/>
   </w:style>
   <w:style w:type="table" w:default="1" w:styleId="NormalTablo">
@@ -3341,7 +5036,7 @@
   <a:extraClrSchemeLst/>
   <a:extLst>
     <a:ext uri="{05A4C25C-085E-4340-85A3-A5531E510DB2}">
-      <thm15:themeFamily xmlns:thm15="http://schemas.microsoft.com/office/thememl/2012/main" xmlns="" name="Office Theme" id="{62F939B6-93AF-4DB8-9C6B-D6C7DFDC589F}" vid="{4A3C46E8-61CC-4603-A589-7422A47A8E4A}"/>
+      <thm15:themeFamily xmlns="" xmlns:thm15="http://schemas.microsoft.com/office/thememl/2012/main" name="Office Theme" id="{62F939B6-93AF-4DB8-9C6B-D6C7DFDC589F}" vid="{4A3C46E8-61CC-4603-A589-7422A47A8E4A}"/>
     </a:ext>
   </a:extLst>
 </a:theme>

</xml_diff>